<commit_message>
feat: add ISSN/accreditation mentoring SOP and update journal proposal templates
Add 3 new documents for the ISSN & journal accreditation mentoring procedure:
- SOP-Pendampingan-ISSN-Akreditasi-Jurnal.docx
- Template-Surat-Pendampingan-ISSN-Akreditasi.docx
- Template-Lampiran-Formulir-Pendampingan-ISSN-Akreditasi.docx

Update R1 journal proposal letter and attachment templates with manual edits.
Exclude CLAUDE.md and Testing-DOCX-Skill.docx from tracking via .gitignore.

Co-Authored-By: Claude Opus 4.8 <noreply@anthropic.com>
</commit_message>
<xml_diff>
--- a/R1 Template-Lampiran-Formulir-Usulan-Jurnal-Baru.docx
+++ b/R1 Template-Lampiran-Formulir-Usulan-Jurnal-Baru.docx
@@ -102,12 +102,6 @@
         <w:gridCol w:w="6180"/>
       </w:tblGrid>
       <w:tr>
-        <w:tblPrEx>
-          <w:tblCellMar>
-            <w:top w:w="0" w:type="dxa"/>
-            <w:bottom w:w="0" w:type="dxa"/>
-          </w:tblCellMar>
-        </w:tblPrEx>
         <w:tc>
           <w:tcPr>
             <w:tcW w:w="1757" w:type="dxa"/>
@@ -167,12 +161,6 @@
         </w:tc>
       </w:tr>
       <w:tr>
-        <w:tblPrEx>
-          <w:tblCellMar>
-            <w:top w:w="0" w:type="dxa"/>
-            <w:bottom w:w="0" w:type="dxa"/>
-          </w:tblCellMar>
-        </w:tblPrEx>
         <w:tc>
           <w:tcPr>
             <w:tcW w:w="1757" w:type="dxa"/>
@@ -292,12 +280,6 @@
         <w:gridCol w:w="6180"/>
       </w:tblGrid>
       <w:tr>
-        <w:tblPrEx>
-          <w:tblCellMar>
-            <w:top w:w="0" w:type="dxa"/>
-            <w:bottom w:w="0" w:type="dxa"/>
-          </w:tblCellMar>
-        </w:tblPrEx>
         <w:tc>
           <w:tcPr>
             <w:tcW w:w="1757" w:type="dxa"/>
@@ -325,7 +307,7 @@
                 <w:b/>
                 <w:bCs/>
               </w:rPr>
-              <w:t>Nama Jurnal (Indonesia)</w:t>
+              <w:t xml:space="preserve">Nama Jurnal </w:t>
             </w:r>
           </w:p>
         </w:tc>
@@ -357,77 +339,6 @@
         </w:tc>
       </w:tr>
       <w:tr>
-        <w:tblPrEx>
-          <w:tblCellMar>
-            <w:top w:w="0" w:type="dxa"/>
-            <w:bottom w:w="0" w:type="dxa"/>
-          </w:tblCellMar>
-        </w:tblPrEx>
-        <w:tc>
-          <w:tcPr>
-            <w:tcW w:w="1757" w:type="dxa"/>
-            <w:tcBorders>
-              <w:top w:val="single" w:sz="4" w:space="0" w:color="BFBFBF"/>
-              <w:left w:val="single" w:sz="4" w:space="0" w:color="BFBFBF"/>
-              <w:bottom w:val="single" w:sz="4" w:space="0" w:color="BFBFBF"/>
-              <w:right w:val="single" w:sz="4" w:space="0" w:color="BFBFBF"/>
-            </w:tcBorders>
-            <w:shd w:val="clear" w:color="auto" w:fill="F2F2F2"/>
-            <w:tcMar>
-              <w:top w:w="80" w:type="dxa"/>
-              <w:left w:w="120" w:type="dxa"/>
-              <w:bottom w:w="80" w:type="dxa"/>
-              <w:right w:w="120" w:type="dxa"/>
-            </w:tcMar>
-            <w:vAlign w:val="center"/>
-          </w:tcPr>
-          <w:p>
-            <w:pPr>
-              <w:spacing w:line="264" w:lineRule="auto"/>
-            </w:pPr>
-            <w:r>
-              <w:rPr>
-                <w:b/>
-                <w:bCs/>
-              </w:rPr>
-              <w:t>Nama Jurnal (Inggris)</w:t>
-            </w:r>
-          </w:p>
-        </w:tc>
-        <w:tc>
-          <w:tcPr>
-            <w:tcW w:w="6180" w:type="dxa"/>
-            <w:tcBorders>
-              <w:top w:val="single" w:sz="4" w:space="0" w:color="BFBFBF"/>
-              <w:left w:val="single" w:sz="4" w:space="0" w:color="BFBFBF"/>
-              <w:bottom w:val="single" w:sz="4" w:space="0" w:color="BFBFBF"/>
-              <w:right w:val="single" w:sz="4" w:space="0" w:color="BFBFBF"/>
-            </w:tcBorders>
-            <w:tcMar>
-              <w:top w:w="80" w:type="dxa"/>
-              <w:left w:w="120" w:type="dxa"/>
-              <w:bottom w:w="80" w:type="dxa"/>
-              <w:right w:w="120" w:type="dxa"/>
-            </w:tcMar>
-            <w:vAlign w:val="center"/>
-          </w:tcPr>
-          <w:p>
-            <w:pPr>
-              <w:spacing w:line="264" w:lineRule="auto"/>
-            </w:pPr>
-            <w:r>
-              <w:t>………………………………………………………………………</w:t>
-            </w:r>
-          </w:p>
-        </w:tc>
-      </w:tr>
-      <w:tr>
-        <w:tblPrEx>
-          <w:tblCellMar>
-            <w:top w:w="0" w:type="dxa"/>
-            <w:bottom w:w="0" w:type="dxa"/>
-          </w:tblCellMar>
-        </w:tblPrEx>
         <w:tc>
           <w:tcPr>
             <w:tcW w:w="1757" w:type="dxa"/>
@@ -487,12 +398,6 @@
         </w:tc>
       </w:tr>
       <w:tr>
-        <w:tblPrEx>
-          <w:tblCellMar>
-            <w:top w:w="0" w:type="dxa"/>
-            <w:bottom w:w="0" w:type="dxa"/>
-          </w:tblCellMar>
-        </w:tblPrEx>
         <w:tc>
           <w:tcPr>
             <w:tcW w:w="1757" w:type="dxa"/>
@@ -631,39 +536,9 @@
               <w:jc w:val="both"/>
             </w:pPr>
           </w:p>
-          <w:p>
-            <w:pPr>
-              <w:spacing w:after="80" w:line="276" w:lineRule="auto"/>
-              <w:jc w:val="both"/>
-            </w:pPr>
-          </w:p>
-          <w:p>
-            <w:pPr>
-              <w:spacing w:after="80" w:line="276" w:lineRule="auto"/>
-              <w:jc w:val="both"/>
-            </w:pPr>
-          </w:p>
         </w:tc>
       </w:tr>
     </w:tbl>
-    <w:p>
-      <w:pPr>
-        <w:spacing w:after="80" w:line="276" w:lineRule="auto"/>
-        <w:jc w:val="both"/>
-      </w:pPr>
-    </w:p>
-    <w:p>
-      <w:pPr>
-        <w:spacing w:after="80" w:line="276" w:lineRule="auto"/>
-        <w:jc w:val="both"/>
-      </w:pPr>
-    </w:p>
-    <w:p>
-      <w:pPr>
-        <w:spacing w:after="80" w:line="276" w:lineRule="auto"/>
-        <w:jc w:val="both"/>
-      </w:pPr>
-    </w:p>
     <w:p>
       <w:pPr>
         <w:pBdr>
@@ -681,7 +556,6 @@
           <w:sz w:val="26"/>
           <w:szCs w:val="26"/>
         </w:rPr>
-        <w:lastRenderedPageBreak/>
         <w:t xml:space="preserve">  C.  </w:t>
       </w:r>
       <w:r>
@@ -717,12 +591,6 @@
         <w:gridCol w:w="5137"/>
       </w:tblGrid>
       <w:tr>
-        <w:tblPrEx>
-          <w:tblCellMar>
-            <w:top w:w="0" w:type="dxa"/>
-            <w:bottom w:w="0" w:type="dxa"/>
-          </w:tblCellMar>
-        </w:tblPrEx>
         <w:tc>
           <w:tcPr>
             <w:tcW w:w="2800" w:type="dxa"/>
@@ -782,12 +650,6 @@
         </w:tc>
       </w:tr>
       <w:tr>
-        <w:tblPrEx>
-          <w:tblCellMar>
-            <w:top w:w="0" w:type="dxa"/>
-            <w:bottom w:w="0" w:type="dxa"/>
-          </w:tblCellMar>
-        </w:tblPrEx>
         <w:tc>
           <w:tcPr>
             <w:tcW w:w="2800" w:type="dxa"/>
@@ -847,12 +709,6 @@
         </w:tc>
       </w:tr>
       <w:tr>
-        <w:tblPrEx>
-          <w:tblCellMar>
-            <w:top w:w="0" w:type="dxa"/>
-            <w:bottom w:w="0" w:type="dxa"/>
-          </w:tblCellMar>
-        </w:tblPrEx>
         <w:tc>
           <w:tcPr>
             <w:tcW w:w="2800" w:type="dxa"/>
@@ -926,6 +782,7 @@
           <w:sz w:val="26"/>
           <w:szCs w:val="26"/>
         </w:rPr>
+        <w:lastRenderedPageBreak/>
         <w:t xml:space="preserve">  D.  </w:t>
       </w:r>
       <w:r>
@@ -961,12 +818,6 @@
         <w:gridCol w:w="6180"/>
       </w:tblGrid>
       <w:tr>
-        <w:tblPrEx>
-          <w:tblCellMar>
-            <w:top w:w="0" w:type="dxa"/>
-            <w:bottom w:w="0" w:type="dxa"/>
-          </w:tblCellMar>
-        </w:tblPrEx>
         <w:tc>
           <w:tcPr>
             <w:tcW w:w="1757" w:type="dxa"/>
@@ -1026,12 +877,6 @@
         </w:tc>
       </w:tr>
       <w:tr>
-        <w:tblPrEx>
-          <w:tblCellMar>
-            <w:top w:w="0" w:type="dxa"/>
-            <w:bottom w:w="0" w:type="dxa"/>
-          </w:tblCellMar>
-        </w:tblPrEx>
         <w:tc>
           <w:tcPr>
             <w:tcW w:w="1757" w:type="dxa"/>
@@ -1091,12 +936,6 @@
         </w:tc>
       </w:tr>
       <w:tr>
-        <w:tblPrEx>
-          <w:tblCellMar>
-            <w:top w:w="0" w:type="dxa"/>
-            <w:bottom w:w="0" w:type="dxa"/>
-          </w:tblCellMar>
-        </w:tblPrEx>
         <w:tc>
           <w:tcPr>
             <w:tcW w:w="1757" w:type="dxa"/>
@@ -1156,12 +995,6 @@
         </w:tc>
       </w:tr>
       <w:tr>
-        <w:tblPrEx>
-          <w:tblCellMar>
-            <w:top w:w="0" w:type="dxa"/>
-            <w:bottom w:w="0" w:type="dxa"/>
-          </w:tblCellMar>
-        </w:tblPrEx>
         <w:tc>
           <w:tcPr>
             <w:tcW w:w="1757" w:type="dxa"/>
@@ -1221,12 +1054,6 @@
         </w:tc>
       </w:tr>
       <w:tr>
-        <w:tblPrEx>
-          <w:tblCellMar>
-            <w:top w:w="0" w:type="dxa"/>
-            <w:bottom w:w="0" w:type="dxa"/>
-          </w:tblCellMar>
-        </w:tblPrEx>
         <w:tc>
           <w:tcPr>
             <w:tcW w:w="1757" w:type="dxa"/>
@@ -1365,12 +1192,6 @@
         <w:gridCol w:w="6180"/>
       </w:tblGrid>
       <w:tr>
-        <w:tblPrEx>
-          <w:tblCellMar>
-            <w:top w:w="0" w:type="dxa"/>
-            <w:bottom w:w="0" w:type="dxa"/>
-          </w:tblCellMar>
-        </w:tblPrEx>
         <w:tc>
           <w:tcPr>
             <w:tcW w:w="1757" w:type="dxa"/>
@@ -1430,12 +1251,6 @@
         </w:tc>
       </w:tr>
       <w:tr>
-        <w:tblPrEx>
-          <w:tblCellMar>
-            <w:top w:w="0" w:type="dxa"/>
-            <w:bottom w:w="0" w:type="dxa"/>
-          </w:tblCellMar>
-        </w:tblPrEx>
         <w:tc>
           <w:tcPr>
             <w:tcW w:w="1757" w:type="dxa"/>
@@ -1495,12 +1310,6 @@
         </w:tc>
       </w:tr>
       <w:tr>
-        <w:tblPrEx>
-          <w:tblCellMar>
-            <w:top w:w="0" w:type="dxa"/>
-            <w:bottom w:w="0" w:type="dxa"/>
-          </w:tblCellMar>
-        </w:tblPrEx>
         <w:tc>
           <w:tcPr>
             <w:tcW w:w="1757" w:type="dxa"/>
@@ -1560,12 +1369,6 @@
         </w:tc>
       </w:tr>
       <w:tr>
-        <w:tblPrEx>
-          <w:tblCellMar>
-            <w:top w:w="0" w:type="dxa"/>
-            <w:bottom w:w="0" w:type="dxa"/>
-          </w:tblCellMar>
-        </w:tblPrEx>
         <w:tc>
           <w:tcPr>
             <w:tcW w:w="1757" w:type="dxa"/>
@@ -1661,12 +1464,6 @@
         <w:gridCol w:w="6180"/>
       </w:tblGrid>
       <w:tr>
-        <w:tblPrEx>
-          <w:tblCellMar>
-            <w:top w:w="0" w:type="dxa"/>
-            <w:bottom w:w="0" w:type="dxa"/>
-          </w:tblCellMar>
-        </w:tblPrEx>
         <w:tc>
           <w:tcPr>
             <w:tcW w:w="1757" w:type="dxa"/>
@@ -1726,12 +1523,6 @@
         </w:tc>
       </w:tr>
       <w:tr>
-        <w:tblPrEx>
-          <w:tblCellMar>
-            <w:top w:w="0" w:type="dxa"/>
-            <w:bottom w:w="0" w:type="dxa"/>
-          </w:tblCellMar>
-        </w:tblPrEx>
         <w:tc>
           <w:tcPr>
             <w:tcW w:w="1757" w:type="dxa"/>
@@ -1759,7 +1550,6 @@
                 <w:b/>
                 <w:bCs/>
               </w:rPr>
-              <w:lastRenderedPageBreak/>
               <w:t>NIP / NIDN (jika dari Unsoed)</w:t>
             </w:r>
           </w:p>
@@ -1792,12 +1582,6 @@
         </w:tc>
       </w:tr>
       <w:tr>
-        <w:tblPrEx>
-          <w:tblCellMar>
-            <w:top w:w="0" w:type="dxa"/>
-            <w:bottom w:w="0" w:type="dxa"/>
-          </w:tblCellMar>
-        </w:tblPrEx>
         <w:tc>
           <w:tcPr>
             <w:tcW w:w="1757" w:type="dxa"/>
@@ -1857,12 +1641,6 @@
         </w:tc>
       </w:tr>
       <w:tr>
-        <w:tblPrEx>
-          <w:tblCellMar>
-            <w:top w:w="0" w:type="dxa"/>
-            <w:bottom w:w="0" w:type="dxa"/>
-          </w:tblCellMar>
-        </w:tblPrEx>
         <w:tc>
           <w:tcPr>
             <w:tcW w:w="1757" w:type="dxa"/>
@@ -1922,12 +1700,6 @@
         </w:tc>
       </w:tr>
       <w:tr>
-        <w:tblPrEx>
-          <w:tblCellMar>
-            <w:top w:w="0" w:type="dxa"/>
-            <w:bottom w:w="0" w:type="dxa"/>
-          </w:tblCellMar>
-        </w:tblPrEx>
         <w:tc>
           <w:tcPr>
             <w:tcW w:w="1757" w:type="dxa"/>
@@ -1998,6 +1770,7 @@
           <w:bCs/>
           <w:color w:val="0B2A4A"/>
         </w:rPr>
+        <w:lastRenderedPageBreak/>
         <w:t xml:space="preserve">  Anggota Dewan Editor — 3  </w:t>
       </w:r>
     </w:p>
@@ -2023,12 +1796,6 @@
         <w:gridCol w:w="6180"/>
       </w:tblGrid>
       <w:tr>
-        <w:tblPrEx>
-          <w:tblCellMar>
-            <w:top w:w="0" w:type="dxa"/>
-            <w:bottom w:w="0" w:type="dxa"/>
-          </w:tblCellMar>
-        </w:tblPrEx>
         <w:tc>
           <w:tcPr>
             <w:tcW w:w="1757" w:type="dxa"/>
@@ -2088,12 +1855,6 @@
         </w:tc>
       </w:tr>
       <w:tr>
-        <w:tblPrEx>
-          <w:tblCellMar>
-            <w:top w:w="0" w:type="dxa"/>
-            <w:bottom w:w="0" w:type="dxa"/>
-          </w:tblCellMar>
-        </w:tblPrEx>
         <w:tc>
           <w:tcPr>
             <w:tcW w:w="1757" w:type="dxa"/>
@@ -2153,12 +1914,6 @@
         </w:tc>
       </w:tr>
       <w:tr>
-        <w:tblPrEx>
-          <w:tblCellMar>
-            <w:top w:w="0" w:type="dxa"/>
-            <w:bottom w:w="0" w:type="dxa"/>
-          </w:tblCellMar>
-        </w:tblPrEx>
         <w:tc>
           <w:tcPr>
             <w:tcW w:w="1757" w:type="dxa"/>
@@ -2218,12 +1973,6 @@
         </w:tc>
       </w:tr>
       <w:tr>
-        <w:tblPrEx>
-          <w:tblCellMar>
-            <w:top w:w="0" w:type="dxa"/>
-            <w:bottom w:w="0" w:type="dxa"/>
-          </w:tblCellMar>
-        </w:tblPrEx>
         <w:tc>
           <w:tcPr>
             <w:tcW w:w="1757" w:type="dxa"/>
@@ -2319,12 +2068,6 @@
         <w:gridCol w:w="6180"/>
       </w:tblGrid>
       <w:tr>
-        <w:tblPrEx>
-          <w:tblCellMar>
-            <w:top w:w="0" w:type="dxa"/>
-            <w:bottom w:w="0" w:type="dxa"/>
-          </w:tblCellMar>
-        </w:tblPrEx>
         <w:tc>
           <w:tcPr>
             <w:tcW w:w="1757" w:type="dxa"/>
@@ -2384,12 +2127,6 @@
         </w:tc>
       </w:tr>
       <w:tr>
-        <w:tblPrEx>
-          <w:tblCellMar>
-            <w:top w:w="0" w:type="dxa"/>
-            <w:bottom w:w="0" w:type="dxa"/>
-          </w:tblCellMar>
-        </w:tblPrEx>
         <w:tc>
           <w:tcPr>
             <w:tcW w:w="1757" w:type="dxa"/>
@@ -2449,12 +2186,6 @@
         </w:tc>
       </w:tr>
       <w:tr>
-        <w:tblPrEx>
-          <w:tblCellMar>
-            <w:top w:w="0" w:type="dxa"/>
-            <w:bottom w:w="0" w:type="dxa"/>
-          </w:tblCellMar>
-        </w:tblPrEx>
         <w:tc>
           <w:tcPr>
             <w:tcW w:w="1757" w:type="dxa"/>
@@ -2514,12 +2245,6 @@
         </w:tc>
       </w:tr>
       <w:tr>
-        <w:tblPrEx>
-          <w:tblCellMar>
-            <w:top w:w="0" w:type="dxa"/>
-            <w:bottom w:w="0" w:type="dxa"/>
-          </w:tblCellMar>
-        </w:tblPrEx>
         <w:tc>
           <w:tcPr>
             <w:tcW w:w="1757" w:type="dxa"/>
@@ -2615,12 +2340,6 @@
         <w:gridCol w:w="6180"/>
       </w:tblGrid>
       <w:tr>
-        <w:tblPrEx>
-          <w:tblCellMar>
-            <w:top w:w="0" w:type="dxa"/>
-            <w:bottom w:w="0" w:type="dxa"/>
-          </w:tblCellMar>
-        </w:tblPrEx>
         <w:tc>
           <w:tcPr>
             <w:tcW w:w="1757" w:type="dxa"/>
@@ -2680,12 +2399,6 @@
         </w:tc>
       </w:tr>
       <w:tr>
-        <w:tblPrEx>
-          <w:tblCellMar>
-            <w:top w:w="0" w:type="dxa"/>
-            <w:bottom w:w="0" w:type="dxa"/>
-          </w:tblCellMar>
-        </w:tblPrEx>
         <w:tc>
           <w:tcPr>
             <w:tcW w:w="1757" w:type="dxa"/>
@@ -2745,12 +2458,6 @@
         </w:tc>
       </w:tr>
       <w:tr>
-        <w:tblPrEx>
-          <w:tblCellMar>
-            <w:top w:w="0" w:type="dxa"/>
-            <w:bottom w:w="0" w:type="dxa"/>
-          </w:tblCellMar>
-        </w:tblPrEx>
         <w:tc>
           <w:tcPr>
             <w:tcW w:w="1757" w:type="dxa"/>
@@ -2810,12 +2517,6 @@
         </w:tc>
       </w:tr>
       <w:tr>
-        <w:tblPrEx>
-          <w:tblCellMar>
-            <w:top w:w="0" w:type="dxa"/>
-            <w:bottom w:w="0" w:type="dxa"/>
-          </w:tblCellMar>
-        </w:tblPrEx>
         <w:tc>
           <w:tcPr>
             <w:tcW w:w="1757" w:type="dxa"/>
@@ -2892,7 +2593,6 @@
           <w:sz w:val="26"/>
           <w:szCs w:val="26"/>
         </w:rPr>
-        <w:lastRenderedPageBreak/>
         <w:t xml:space="preserve">  F.  </w:t>
       </w:r>
       <w:r>
@@ -2968,6 +2668,7 @@
         <w:jc w:val="both"/>
       </w:pPr>
       <w:r>
+        <w:lastRenderedPageBreak/>
         <w:t>Mengikuti ketentuan etika publikasi ilmiah sebagaimana berlaku secara nasional maupun internasional.</w:t>
       </w:r>
     </w:p>
@@ -3069,12 +2770,6 @@
         <w:gridCol w:w="3969"/>
       </w:tblGrid>
       <w:tr>
-        <w:tblPrEx>
-          <w:tblCellMar>
-            <w:top w:w="0" w:type="dxa"/>
-            <w:bottom w:w="0" w:type="dxa"/>
-          </w:tblCellMar>
-        </w:tblPrEx>
         <w:tc>
           <w:tcPr>
             <w:tcW w:w="3968" w:type="dxa"/>
@@ -3105,7 +2800,6 @@
           <w:p>
             <w:pPr>
               <w:spacing w:after="120"/>
-              <w:jc w:val="center"/>
             </w:pPr>
             <w:r>
               <w:rPr>

</xml_diff>